<commit_message>
feat: initialize taste preference documentation and workspace findings tracking files
</commit_message>
<xml_diff>
--- a/backend/workspace/today_s_findings.docx
+++ b/backend/workspace/today_s_findings.docx
@@ -12,7 +12,12 @@
     </w:p>
     <w:p>
       <w:r>
-        <w:t>Today's findings: No specific findings mentioned yet.</w:t>
+        <w:t>Findings: Corrosion on A-12</w:t>
+      </w:r>
+    </w:p>
+    <w:p>
+      <w:r>
+        <w:t>Recommendation: Investigate and address the corrosion issue.</w:t>
       </w:r>
     </w:p>
     <w:sectPr>

</xml_diff>